<commit_message>
snapshot update from baseline ZIP
</commit_message>
<xml_diff>
--- a/seed-downloads/business-funding-prep-kit.docx
+++ b/seed-downloads/business-funding-prep-kit.docx
@@ -101,6 +101,203 @@
     <w:p>
       <w:r>
         <w:t>This kit gives you a clear path. It does not make a decision for the person reading your papers.</w:t>
+      </w:r>
+    </w:p>
+    <w:p>
+      <w:pPr>
+        <w:pStyle w:val="Heading1"/>
+      </w:pPr>
+      <w:r>
+        <w:t>Included Templates and Tools In This Kit</w:t>
+      </w:r>
+    </w:p>
+    <w:p>
+      <w:r>
+        <w:t>This is one direct paid download. The items below are included inside this kit; you do not need to buy them separately or use the free Studio first.</w:t>
+      </w:r>
+    </w:p>
+    <w:p>
+      <w:pPr>
+        <w:pStyle w:val="Heading2"/>
+      </w:pPr>
+      <w:r>
+        <w:t>Business Loan Explanation Letter</w:t>
+      </w:r>
+    </w:p>
+    <w:p>
+      <w:r>
+        <w:t>Use this included tool when your situation involves business loan explanation letter. Fill in only true facts, attach real supporting documents if useful, review the wording, and send it yourself when ready.</w:t>
+      </w:r>
+    </w:p>
+    <w:p>
+      <w:r>
+        <w:t>Template starter:</w:t>
+      </w:r>
+    </w:p>
+    <w:p>
+      <w:r>
+        <w:t>I am writing to explain or organize information related to business loan explanation letter. The truthful facts are: [fill in your facts]. The supporting documents I am including are: [list real documents].</w:t>
+      </w:r>
+    </w:p>
+    <w:p>
+      <w:pPr>
+        <w:pStyle w:val="Heading2"/>
+      </w:pPr>
+      <w:r>
+        <w:t>Sba Document Checklist</w:t>
+      </w:r>
+    </w:p>
+    <w:p>
+      <w:r>
+        <w:t>Use this included tool when your situation involves SBA document checklist. Fill in only true facts, attach real supporting documents if useful, review the wording, and send it yourself when ready.</w:t>
+      </w:r>
+    </w:p>
+    <w:p>
+      <w:r>
+        <w:t>Template starter:</w:t>
+      </w:r>
+    </w:p>
+    <w:p>
+      <w:r>
+        <w:t>I am writing to explain or organize information related to SBA document checklist. The truthful facts are: [fill in your facts]. The supporting documents I am including are: [list real documents].</w:t>
+      </w:r>
+    </w:p>
+    <w:p>
+      <w:pPr>
+        <w:pStyle w:val="Heading2"/>
+      </w:pPr>
+      <w:r>
+        <w:t>Business Income Explanation</w:t>
+      </w:r>
+    </w:p>
+    <w:p>
+      <w:r>
+        <w:t>Use this included tool when your situation involves business income explanation. Fill in only true facts, attach real supporting documents if useful, review the wording, and send it yourself when ready.</w:t>
+      </w:r>
+    </w:p>
+    <w:p>
+      <w:r>
+        <w:t>Template starter:</w:t>
+      </w:r>
+    </w:p>
+    <w:p>
+      <w:r>
+        <w:t>I am writing to explain or organize information related to business income explanation. The truthful facts are: [fill in your facts]. The supporting documents I am including are: [list real documents].</w:t>
+      </w:r>
+    </w:p>
+    <w:p>
+      <w:pPr>
+        <w:pStyle w:val="Heading2"/>
+      </w:pPr>
+      <w:r>
+        <w:t>Cash Flow Explanation</w:t>
+      </w:r>
+    </w:p>
+    <w:p>
+      <w:r>
+        <w:t>Use this included tool when your situation involves cash flow explanation. Fill in only true facts, attach real supporting documents if useful, review the wording, and send it yourself when ready.</w:t>
+      </w:r>
+    </w:p>
+    <w:p>
+      <w:r>
+        <w:t>Template starter:</w:t>
+      </w:r>
+    </w:p>
+    <w:p>
+      <w:r>
+        <w:t>I am writing to explain or organize information related to cash flow explanation. The truthful facts are: [fill in your facts]. The supporting documents I am including are: [list real documents].</w:t>
+      </w:r>
+    </w:p>
+    <w:p>
+      <w:pPr>
+        <w:pStyle w:val="Heading2"/>
+      </w:pPr>
+      <w:r>
+        <w:t>Bank Statement Explanation</w:t>
+      </w:r>
+    </w:p>
+    <w:p>
+      <w:r>
+        <w:t>Use this included tool when your situation involves bank statement explanation. Fill in only true facts, attach real supporting documents if useful, review the wording, and send it yourself when ready.</w:t>
+      </w:r>
+    </w:p>
+    <w:p>
+      <w:r>
+        <w:t>Template starter:</w:t>
+      </w:r>
+    </w:p>
+    <w:p>
+      <w:r>
+        <w:t>I am writing to explain or organize information related to bank statement explanation. The truthful facts are: [fill in your facts]. The supporting documents I am including are: [list real documents].</w:t>
+      </w:r>
+    </w:p>
+    <w:p>
+      <w:pPr>
+        <w:pStyle w:val="Heading2"/>
+      </w:pPr>
+      <w:r>
+        <w:t>Business Address Verification</w:t>
+      </w:r>
+    </w:p>
+    <w:p>
+      <w:r>
+        <w:t>Use this included tool when your situation involves business address verification. Fill in only true facts, attach real supporting documents if useful, review the wording, and send it yourself when ready.</w:t>
+      </w:r>
+    </w:p>
+    <w:p>
+      <w:r>
+        <w:t>Template starter:</w:t>
+      </w:r>
+    </w:p>
+    <w:p>
+      <w:r>
+        <w:t>I am writing to explain or organize information related to business address verification. The truthful facts are: [fill in your facts]. The supporting documents I am including are: [list real documents].</w:t>
+      </w:r>
+    </w:p>
+    <w:p>
+      <w:pPr>
+        <w:pStyle w:val="Heading2"/>
+      </w:pPr>
+      <w:r>
+        <w:t>Use Of Funds Explanation</w:t>
+      </w:r>
+    </w:p>
+    <w:p>
+      <w:r>
+        <w:t>Use this included tool when your situation involves use of funds explanation. Fill in only true facts, attach real supporting documents if useful, review the wording, and send it yourself when ready.</w:t>
+      </w:r>
+    </w:p>
+    <w:p>
+      <w:r>
+        <w:t>Template starter:</w:t>
+      </w:r>
+    </w:p>
+    <w:p>
+      <w:r>
+        <w:t>I am writing to explain or organize information related to use of funds explanation. The truthful facts are: [fill in your facts]. The supporting documents I am including are: [list real documents].</w:t>
+      </w:r>
+    </w:p>
+    <w:p>
+      <w:pPr>
+        <w:pStyle w:val="Heading2"/>
+      </w:pPr>
+      <w:r>
+        <w:t>Lender Follow-Up Letter</w:t>
+      </w:r>
+    </w:p>
+    <w:p>
+      <w:r>
+        <w:t>Use this included tool when your situation involves lender follow-up letter. Fill in only true facts, attach real supporting documents if useful, review the wording, and send it yourself when ready.</w:t>
+      </w:r>
+    </w:p>
+    <w:p>
+      <w:r>
+        <w:t>Template starter:</w:t>
+      </w:r>
+    </w:p>
+    <w:p>
+      <w:r>
+        <w:t>I am writing to explain or organize information related to lender follow-up letter. The truthful facts are: [fill in your facts]. The supporting documents I am including are: [list real documents].</w:t>
       </w:r>
     </w:p>
     <w:p>

</xml_diff>